<commit_message>
laneA2(F0L): PLI_M02 — mục 12 CSHHL khai theo Mẫu số 10 (bỏ Có/Không), cam kết NĐTNN Điều 7 NĐ 296/2026 + Phụ lục CAM KẾT (p22), GCNĐKĐT wording, Uỷ ban, khối HKD + inventory p11-p22
</commit_message>
<xml_diff>
--- a/06_ho_kinh_doanh_va_chuyen_doi/02_chuyen_doi_hkd_sang_dn/DN_PL1_Mau_02_giay_de_nghi_dang_ky_doanh_nghiep_cong_ty_trach_nhiem_huu_han_mot_thanh_vien.docx
+++ b/06_ho_kinh_doanh_va_chuyen_doi/02_chuyen_doi_hkd_sang_dn/DN_PL1_Mau_02_giay_de_nghi_dang_ky_doanh_nghiep_cong_ty_trach_nhiem_huu_han_mot_thanh_vien.docx
@@ -947,7 +947,201 @@
           <w:sz w:val="24"/>
           <w:sz-cs w:val="24"/>
         </w:rPr>
-        <w:t xml:space="preserve">Số Giấy chứng nhận đăng ký hộ kinh doanh (</w:t>
+        <w:t>Mã số hộ kinh doanh/Mã số đăng ký hộ kinh doanh/Mã số thuế: ……………………………………</w:t>
+      </w:r>
+      <w:r>
+        <w:rPr>
+          <w:rFonts w:ascii="Arial" w:hAnsi="Arial" w:cs="Arial"/>
+          <w:sz w:val="24"/>
+          <w:sz-cs w:val="24"/>
+          <w:i/>
+        </w:rPr>
+      </w:r>
+      <w:r>
+        <w:rPr>
+          <w:rFonts w:ascii="Arial" w:hAnsi="Arial" w:cs="Arial"/>
+          <w:sz w:val="24"/>
+          <w:sz-cs w:val="24"/>
+        </w:rPr>
+      </w:r>
+    </w:p>
+    <w:p>
+      <w:pPr>
+        <w:spacing w:before="120"/>
+      </w:pPr>
+      <w:r>
+        <w:rPr>
+          <w:i/>
+        </w:rPr>
+        <w:t>Trường hợp không khai thác được thông tin về hộ kinh doanh được chuyển đổi từ Cơ sở dữ liệu về đăng ký hộ kinh doanh hoặc thông tin khai thác được về hộ kinh doanh được chuyển đổi từ Cơ sở dữ liệu về đăng ký hộ kinh doanh không đầy đủ, không chính xác thì kê khai thêm các nội dung sau:</w:t>
+      </w:r>
+    </w:p>
+    <w:p>
+      <w:pPr>
+        <w:spacing w:before="120"/>
+      </w:pPr>
+      <w:r>
+        <w:rPr>
+          <w:rFonts w:ascii="Arial" w:hAnsi="Arial" w:cs="Arial"/>
+          <w:sz w:val="24"/>
+          <w:sz-cs w:val="24"/>
+        </w:rPr>
+        <w:t xml:space="preserve">Địa chỉ trụ sở hộ kinh doanh: ………………………………………………</w:t>
+      </w:r>
+    </w:p>
+    <w:p>
+      <w:pPr>
+        <w:spacing w:before="120"/>
+      </w:pPr>
+      <w:r>
+        <w:rPr>
+          <w:rFonts w:ascii="Arial" w:hAnsi="Arial" w:cs="Arial"/>
+          <w:sz w:val="24"/>
+          <w:sz-cs w:val="24"/>
+        </w:rPr>
+        <w:t xml:space="preserve">Tên chủ hộ kinh doanh: ………………………………………………….…</w:t>
+      </w:r>
+    </w:p>
+    <w:p>
+      <w:pPr>
+        <w:spacing w:before="120"/>
+      </w:pPr>
+      <w:r>
+        <w:rPr>
+          <w:rFonts w:ascii="Arial" w:hAnsi="Arial" w:cs="Arial"/>
+          <w:sz w:val="24"/>
+          <w:sz-cs w:val="24"/>
+        </w:rPr>
+        <w:t xml:space="preserve">Loại giấy tờ pháp lý của cá nhân (</w:t>
+      </w:r>
+      <w:r>
+        <w:rPr>
+          <w:rFonts w:ascii="Arial" w:hAnsi="Arial" w:cs="Arial"/>
+          <w:sz w:val="24"/>
+          <w:sz-cs w:val="24"/>
+          <w:i/>
+        </w:rPr>
+        <w:t xml:space="preserve">kê khai theo giấy tờ pháp lý của cá nhân được ghi trên Giấy chứng nhận đăng ký thuế của hộ kinh doanh</w:t>
+      </w:r>
+      <w:r>
+        <w:rPr>
+          <w:rFonts w:ascii="Arial" w:hAnsi="Arial" w:cs="Arial"/>
+          <w:sz w:val="24"/>
+          <w:sz-cs w:val="24"/>
+        </w:rPr>
+        <w:t xml:space="preserve">):</w:t>
+      </w:r>
+    </w:p>
+    <w:p>
+      <w:pPr>
+        <w:spacing w:before="120"/>
+      </w:pPr>
+      <w:r>
+        <w:rPr>
+          <w:rFonts w:ascii="Arial" w:hAnsi="Arial" w:cs="Arial"/>
+          <w:sz w:val="24"/>
+          <w:sz-cs w:val="24"/>
+        </w:rPr>
+        <w:t xml:space="preserve">□ Chứng minh nhân dân</w:t>
+      </w:r>
+    </w:p>
+    <w:p>
+      <w:pPr>
+        <w:spacing w:before="120"/>
+      </w:pPr>
+      <w:r>
+        <w:rPr>
+          <w:rFonts w:ascii="Arial" w:hAnsi="Arial" w:cs="Arial"/>
+          <w:sz w:val="24"/>
+          <w:sz-cs w:val="24"/>
+        </w:rPr>
+        <w:t xml:space="preserve">□ Căn cước công dân</w:t>
+      </w:r>
+    </w:p>
+    <w:p>
+      <w:pPr>
+        <w:spacing w:before="120"/>
+      </w:pPr>
+      <w:r>
+        <w:rPr>
+          <w:rFonts w:ascii="Arial" w:hAnsi="Arial" w:cs="Arial"/>
+          <w:sz w:val="24"/>
+          <w:sz-cs w:val="24"/>
+        </w:rPr>
+        <w:t xml:space="preserve">□ Hộ chiếu</w:t>
+      </w:r>
+    </w:p>
+    <w:p>
+      <w:pPr>
+        <w:spacing w:before="120"/>
+      </w:pPr>
+      <w:r>
+        <w:rPr>
+          <w:rFonts w:ascii="Arial" w:hAnsi="Arial" w:cs="Arial"/>
+          <w:sz w:val="24"/>
+          <w:sz-cs w:val="24"/>
+        </w:rPr>
+        <w:t xml:space="preserve">□ Loại khác (</w:t>
+      </w:r>
+      <w:r>
+        <w:rPr>
+          <w:rFonts w:ascii="Arial" w:hAnsi="Arial" w:cs="Arial"/>
+          <w:sz w:val="24"/>
+          <w:sz-cs w:val="24"/>
+          <w:i/>
+        </w:rPr>
+        <w:t xml:space="preserve">ghi rõ</w:t>
+      </w:r>
+      <w:r>
+        <w:rPr>
+          <w:rFonts w:ascii="Arial" w:hAnsi="Arial" w:cs="Arial"/>
+          <w:sz w:val="24"/>
+          <w:sz-cs w:val="24"/>
+        </w:rPr>
+        <w:t xml:space="preserve">):…………</w:t>
+      </w:r>
+    </w:p>
+    <w:p>
+      <w:pPr>
+        <w:spacing w:before="120"/>
+      </w:pPr>
+      <w:r>
+        <w:rPr>
+          <w:rFonts w:ascii="Arial" w:hAnsi="Arial" w:cs="Arial"/>
+          <w:sz w:val="24"/>
+          <w:sz-cs w:val="24"/>
+        </w:rPr>
+        <w:t xml:space="preserve">Số giấy tờ pháp lý của cá nhân (</w:t>
+      </w:r>
+      <w:r>
+        <w:rPr>
+          <w:rFonts w:ascii="Arial" w:hAnsi="Arial" w:cs="Arial"/>
+          <w:sz w:val="24"/>
+          <w:sz-cs w:val="24"/>
+          <w:i/>
+        </w:rPr>
+        <w:t xml:space="preserve">kê khai theo giấy tờ pháp lý của cá nhân được ghi trên Giấy chứng nhận đăng ký thuế của hộ kinh doanh</w:t>
+      </w:r>
+      <w:r>
+        <w:rPr>
+          <w:rFonts w:ascii="Arial" w:hAnsi="Arial" w:cs="Arial"/>
+          <w:sz w:val="24"/>
+          <w:sz-cs w:val="24"/>
+        </w:rPr>
+        <w:t xml:space="preserve">): ……………</w:t>
+      </w:r>
+    </w:p>
+    <w:p>
+      <w:pPr>
+        <w:spacing w:before="120"/>
+      </w:pPr>
+      <w:r>
+        <w:rPr>
+          <w:rFonts w:ascii="Arial" w:hAnsi="Arial" w:cs="Arial"/>
+          <w:sz w:val="24"/>
+          <w:sz-cs w:val="24"/>
+        </w:rPr>
+        <w:t xml:space="preserve">Ngày cấp: …./…./….Nơi cấp: ………..Ngày hết hạn (</w:t>
       </w:r>
       <w:r>
         <w:rPr>
@@ -964,59 +1158,145 @@
           <w:sz w:val="24"/>
           <w:sz-cs w:val="24"/>
         </w:rPr>
-        <w:t xml:space="preserve">): ………………...</w:t>
-      </w:r>
-    </w:p>
-    <w:p>
-      <w:pPr>
-        <w:spacing w:before="120"/>
-      </w:pPr>
-      <w:r>
-        <w:rPr>
-          <w:rFonts w:ascii="Arial" w:hAnsi="Arial" w:cs="Arial"/>
-          <w:sz w:val="24"/>
-          <w:sz-cs w:val="24"/>
-        </w:rPr>
-        <w:t xml:space="preserve">Ngày cấp: ……./………../……… Nơi cấp: ……………………………….</w:t>
-      </w:r>
-    </w:p>
-    <w:p>
-      <w:pPr>
-        <w:spacing w:before="120"/>
-      </w:pPr>
-      <w:r>
-        <w:rPr>
-          <w:rFonts w:ascii="Arial" w:hAnsi="Arial" w:cs="Arial"/>
-          <w:sz w:val="24"/>
-          <w:sz-cs w:val="24"/>
-        </w:rPr>
-        <w:t xml:space="preserve">Mã số thuế của hộ kinh doanh: ……………………………………………</w:t>
-      </w:r>
-    </w:p>
-    <w:p>
-      <w:pPr>
-        <w:spacing w:before="120"/>
-      </w:pPr>
-      <w:r>
-        <w:rPr>
-          <w:rFonts w:ascii="Arial" w:hAnsi="Arial" w:cs="Arial"/>
-          <w:sz w:val="24"/>
-          <w:sz-cs w:val="24"/>
-        </w:rPr>
-        <w:t xml:space="preserve">Địa chỉ trụ sở hộ kinh doanh: ………………………………………………</w:t>
-      </w:r>
-    </w:p>
-    <w:p>
-      <w:pPr>
-        <w:spacing w:before="120"/>
-      </w:pPr>
-      <w:r>
-        <w:rPr>
-          <w:rFonts w:ascii="Arial" w:hAnsi="Arial" w:cs="Arial"/>
-          <w:sz w:val="24"/>
-          <w:sz-cs w:val="24"/>
-        </w:rPr>
-        <w:t xml:space="preserve">Tên chủ hộ kinh doanh: ………………………………………………….…</w:t>
+        <w:t xml:space="preserve">): …/…/…</w:t>
+      </w:r>
+    </w:p>
+    <w:p>
+      <w:pPr>
+        <w:spacing w:before="120"/>
+      </w:pPr>
+      <w:r>
+        <w:rPr>
+          <w:rFonts w:ascii="Arial" w:hAnsi="Arial" w:cs="Arial"/>
+          <w:sz w:val="24"/>
+          <w:sz-cs w:val="24"/>
+          <w:b/>
+        </w:rPr>
+        <w:t xml:space="preserve">- Thông tin về cơ sở bảo trợ xã hội/quỹ xã hội/quỹ từ thiện được chuyển đổi </w:t>
+      </w:r>
+      <w:r>
+        <w:rPr>
+          <w:rFonts w:ascii="Arial" w:hAnsi="Arial" w:cs="Arial"/>
+          <w:sz w:val="24"/>
+          <w:sz-cs w:val="24"/>
+        </w:rPr>
+        <w:t xml:space="preserve">(</w:t>
+      </w:r>
+      <w:r>
+        <w:rPr>
+          <w:rFonts w:ascii="Arial" w:hAnsi="Arial" w:cs="Arial"/>
+          <w:sz w:val="24"/>
+          <w:sz-cs w:val="24"/>
+          <w:i/>
+        </w:rPr>
+        <w:t xml:space="preserve">phải kê khai trong trường hợp thành lập doanh nghiệp xã hội trên cơ sở chuyển đổi từ cơ sở bảo trợ xã hội/quỹ xã hội/quỹ từ thiện</w:t>
+      </w:r>
+      <w:r>
+        <w:rPr>
+          <w:rFonts w:ascii="Arial" w:hAnsi="Arial" w:cs="Arial"/>
+          <w:sz w:val="24"/>
+          <w:sz-cs w:val="24"/>
+        </w:rPr>
+        <w:t xml:space="preserve">): </w:t>
+      </w:r>
+    </w:p>
+    <w:p>
+      <w:pPr>
+        <w:spacing w:before="120"/>
+      </w:pPr>
+      <w:r>
+        <w:rPr>
+          <w:rFonts w:ascii="Arial" w:hAnsi="Arial" w:cs="Arial"/>
+          <w:sz w:val="24"/>
+          <w:sz-cs w:val="24"/>
+        </w:rPr>
+        <w:t xml:space="preserve">Tên cơ sở bảo trợ xã hội/quỹ xã hội/quỹ từ thiện (</w:t>
+      </w:r>
+      <w:r>
+        <w:rPr>
+          <w:rFonts w:ascii="Arial" w:hAnsi="Arial" w:cs="Arial"/>
+          <w:sz w:val="24"/>
+          <w:sz-cs w:val="24"/>
+          <w:i/>
+        </w:rPr>
+        <w:t xml:space="preserve">ghi bằng chữ in hoa</w:t>
+      </w:r>
+      <w:r>
+        <w:rPr>
+          <w:rFonts w:ascii="Arial" w:hAnsi="Arial" w:cs="Arial"/>
+          <w:sz w:val="24"/>
+          <w:sz-cs w:val="24"/>
+        </w:rPr>
+        <w:t xml:space="preserve">): …………….</w:t>
+      </w:r>
+    </w:p>
+    <w:p>
+      <w:pPr>
+        <w:spacing w:before="120"/>
+      </w:pPr>
+      <w:r>
+        <w:rPr>
+          <w:rFonts w:ascii="Arial" w:hAnsi="Arial" w:cs="Arial"/>
+          <w:sz w:val="24"/>
+          <w:sz-cs w:val="24"/>
+        </w:rPr>
+        <w:t xml:space="preserve">Số Giấy chứng nhận đăng ký thành lập (Đối với cơ sở bảo trợ xã hội)/Số Giấy phép thành lập và công nhận điều lệ quỹ (Đối với quỹ xã hội/quỹ từ thiện): ……… Ngày cấp: … /… /…… Nơi cấp: ………………………………………………</w:t>
+      </w:r>
+    </w:p>
+    <w:p>
+      <w:pPr>
+        <w:spacing w:before="120"/>
+      </w:pPr>
+      <w:r>
+        <w:rPr>
+          <w:rFonts w:ascii="Arial" w:hAnsi="Arial" w:cs="Arial"/>
+          <w:sz w:val="24"/>
+          <w:sz-cs w:val="24"/>
+        </w:rPr>
+        <w:t xml:space="preserve">Mã số thuế của cơ sở bảo trợ xã hội/quỹ xã hội/quỹ từ thiện (</w:t>
+      </w:r>
+      <w:r>
+        <w:rPr>
+          <w:rFonts w:ascii="Arial" w:hAnsi="Arial" w:cs="Arial"/>
+          <w:sz w:val="24"/>
+          <w:sz-cs w:val="24"/>
+          <w:i/>
+        </w:rPr>
+        <w:t xml:space="preserve">chỉ kê khai mã số thuế 10 số</w:t>
+      </w:r>
+      <w:r>
+        <w:rPr>
+          <w:rFonts w:ascii="Arial" w:hAnsi="Arial" w:cs="Arial"/>
+          <w:sz w:val="24"/>
+          <w:sz-cs w:val="24"/>
+        </w:rPr>
+        <w:t xml:space="preserve">): ………………………………………………</w:t>
+      </w:r>
+    </w:p>
+    <w:p>
+      <w:pPr>
+        <w:spacing w:before="120"/>
+      </w:pPr>
+      <w:r>
+        <w:rPr>
+          <w:rFonts w:ascii="Arial" w:hAnsi="Arial" w:cs="Arial"/>
+          <w:sz w:val="24"/>
+          <w:sz-cs w:val="24"/>
+        </w:rPr>
+        <w:t xml:space="preserve">Địa chỉ trụ sở chính: ……………………………………………………………..</w:t>
+      </w:r>
+    </w:p>
+    <w:p>
+      <w:pPr>
+        <w:spacing w:before="120"/>
+      </w:pPr>
+      <w:r>
+        <w:rPr>
+          <w:rFonts w:ascii="Arial" w:hAnsi="Arial" w:cs="Arial"/>
+          <w:sz w:val="24"/>
+          <w:sz-cs w:val="24"/>
+        </w:rPr>
+        <w:t xml:space="preserve">Tên người đại diện cơ sở bảo trợ xã hội/quỹ xã hội/quỹ từ thiện: ………….</w:t>
       </w:r>
     </w:p>
     <w:p>
@@ -1038,7 +1318,7 @@
           <w:sz-cs w:val="24"/>
           <w:i/>
         </w:rPr>
-        <w:t xml:space="preserve">kê khai theo giấy tờ pháp lý của cá nhân được ghi trên Giấy chứng nhận đăng ký thuế của hộ kinh doanh</w:t>
+        <w:t xml:space="preserve">kê khai theo giấy tờ pháp lý của cá nhân được ghi trên Giấy chứng nhận đăng ký thuế của cơ sở bảo trợ xã hội/quỹ xã hội/quỹ từ thiện</w:t>
       </w:r>
       <w:r>
         <w:rPr>
@@ -1137,15 +1417,15 @@
           <w:sz-cs w:val="24"/>
           <w:i/>
         </w:rPr>
-        <w:t xml:space="preserve">kê khai theo giấy tờ pháp lý của cá nhân được ghi trên Giấy chứng nhận đăng ký thuế của hộ kinh doanh</w:t>
-      </w:r>
-      <w:r>
-        <w:rPr>
-          <w:rFonts w:ascii="Arial" w:hAnsi="Arial" w:cs="Arial"/>
-          <w:sz w:val="24"/>
-          <w:sz-cs w:val="24"/>
-        </w:rPr>
-        <w:t xml:space="preserve">): ……………</w:t>
+        <w:t xml:space="preserve">kê khai theo giấy tờ pháp lý của cá nhân được ghi trên Giấy chứng nhận đăng ký thuế của cơ sở bảo trợ xã hội/quỹ xã hội/quỹ từ thiện</w:t>
+      </w:r>
+      <w:r>
+        <w:rPr>
+          <w:rFonts w:ascii="Arial" w:hAnsi="Arial" w:cs="Arial"/>
+          <w:sz w:val="24"/>
+          <w:sz-cs w:val="24"/>
+        </w:rPr>
+        <w:t xml:space="preserve">): ……………….</w:t>
       </w:r>
     </w:p>
     <w:p>
@@ -1187,306 +1467,23 @@
           <w:rFonts w:ascii="Arial" w:hAnsi="Arial" w:cs="Arial"/>
           <w:sz w:val="24"/>
           <w:sz-cs w:val="24"/>
+        </w:rPr>
+        <w:t xml:space="preserve">- </w:t>
+      </w:r>
+      <w:r>
+        <w:rPr>
+          <w:rFonts w:ascii="Arial" w:hAnsi="Arial" w:cs="Arial"/>
+          <w:sz w:val="24"/>
+          <w:sz-cs w:val="24"/>
           <w:b/>
         </w:rPr>
-        <w:t xml:space="preserve">- Thông tin về cơ sở bảo trợ xã hội/quỹ xã hội/quỹ từ thiện được chuyển đổi </w:t>
-      </w:r>
-      <w:r>
-        <w:rPr>
-          <w:rFonts w:ascii="Arial" w:hAnsi="Arial" w:cs="Arial"/>
-          <w:sz w:val="24"/>
-          <w:sz-cs w:val="24"/>
-        </w:rPr>
-        <w:t xml:space="preserve">(</w:t>
-      </w:r>
-      <w:r>
-        <w:rPr>
-          <w:rFonts w:ascii="Arial" w:hAnsi="Arial" w:cs="Arial"/>
-          <w:sz w:val="24"/>
-          <w:sz-cs w:val="24"/>
-          <w:i/>
-        </w:rPr>
-        <w:t xml:space="preserve">phải kê khai trong trường hợp thành lập doanh nghiệp xã hội trên cơ sở chuyển đổi từ cơ sở bảo trợ xã hội/quỹ xã hội/quỹ từ thiện</w:t>
-      </w:r>
-      <w:r>
-        <w:rPr>
-          <w:rFonts w:ascii="Arial" w:hAnsi="Arial" w:cs="Arial"/>
-          <w:sz w:val="24"/>
-          <w:sz-cs w:val="24"/>
-        </w:rPr>
-        <w:t xml:space="preserve">): </w:t>
-      </w:r>
-    </w:p>
-    <w:p>
-      <w:pPr>
-        <w:spacing w:before="120"/>
-      </w:pPr>
-      <w:r>
-        <w:rPr>
-          <w:rFonts w:ascii="Arial" w:hAnsi="Arial" w:cs="Arial"/>
-          <w:sz w:val="24"/>
-          <w:sz-cs w:val="24"/>
-        </w:rPr>
-        <w:t xml:space="preserve">Tên cơ sở bảo trợ xã hội/quỹ xã hội/quỹ từ thiện (</w:t>
-      </w:r>
-      <w:r>
-        <w:rPr>
-          <w:rFonts w:ascii="Arial" w:hAnsi="Arial" w:cs="Arial"/>
-          <w:sz w:val="24"/>
-          <w:sz-cs w:val="24"/>
-          <w:i/>
-        </w:rPr>
-        <w:t xml:space="preserve">ghi bằng chữ in hoa</w:t>
-      </w:r>
-      <w:r>
-        <w:rPr>
-          <w:rFonts w:ascii="Arial" w:hAnsi="Arial" w:cs="Arial"/>
-          <w:sz w:val="24"/>
-          <w:sz-cs w:val="24"/>
-        </w:rPr>
-        <w:t xml:space="preserve">): …………….</w:t>
-      </w:r>
-    </w:p>
-    <w:p>
-      <w:pPr>
-        <w:spacing w:before="120"/>
-      </w:pPr>
-      <w:r>
-        <w:rPr>
-          <w:rFonts w:ascii="Arial" w:hAnsi="Arial" w:cs="Arial"/>
-          <w:sz w:val="24"/>
-          <w:sz-cs w:val="24"/>
-        </w:rPr>
-        <w:t xml:space="preserve">Số Giấy chứng nhận đăng ký thành lập (Đối với cơ sở bảo trợ xã hội)/Số Giấy phép thành lập và công nhận điều lệ quỹ (Đối với quỹ xã hội/quỹ từ thiện): ……… Ngày cấp: … /… /…… Nơi cấp: ………………………………………………</w:t>
-      </w:r>
-    </w:p>
-    <w:p>
-      <w:pPr>
-        <w:spacing w:before="120"/>
-      </w:pPr>
-      <w:r>
-        <w:rPr>
-          <w:rFonts w:ascii="Arial" w:hAnsi="Arial" w:cs="Arial"/>
-          <w:sz w:val="24"/>
-          <w:sz-cs w:val="24"/>
-        </w:rPr>
-        <w:t xml:space="preserve">Mã số thuế của cơ sở bảo trợ xã hội/quỹ xã hội/quỹ từ thiện (</w:t>
-      </w:r>
-      <w:r>
-        <w:rPr>
-          <w:rFonts w:ascii="Arial" w:hAnsi="Arial" w:cs="Arial"/>
-          <w:sz w:val="24"/>
-          <w:sz-cs w:val="24"/>
-          <w:i/>
-        </w:rPr>
-        <w:t xml:space="preserve">chỉ kê khai mã số thuế 10 số</w:t>
-      </w:r>
-      <w:r>
-        <w:rPr>
-          <w:rFonts w:ascii="Arial" w:hAnsi="Arial" w:cs="Arial"/>
-          <w:sz w:val="24"/>
-          <w:sz-cs w:val="24"/>
-        </w:rPr>
-        <w:t xml:space="preserve">): ………………………………………………</w:t>
-      </w:r>
-    </w:p>
-    <w:p>
-      <w:pPr>
-        <w:spacing w:before="120"/>
-      </w:pPr>
-      <w:r>
-        <w:rPr>
-          <w:rFonts w:ascii="Arial" w:hAnsi="Arial" w:cs="Arial"/>
-          <w:sz w:val="24"/>
-          <w:sz-cs w:val="24"/>
-        </w:rPr>
-        <w:t xml:space="preserve">Địa chỉ trụ sở chính: ……………………………………………………………..</w:t>
-      </w:r>
-    </w:p>
-    <w:p>
-      <w:pPr>
-        <w:spacing w:before="120"/>
-      </w:pPr>
-      <w:r>
-        <w:rPr>
-          <w:rFonts w:ascii="Arial" w:hAnsi="Arial" w:cs="Arial"/>
-          <w:sz w:val="24"/>
-          <w:sz-cs w:val="24"/>
-        </w:rPr>
-        <w:t xml:space="preserve">Tên người đại diện cơ sở bảo trợ xã hội/quỹ xã hội/quỹ từ thiện: ………….</w:t>
-      </w:r>
-    </w:p>
-    <w:p>
-      <w:pPr>
-        <w:spacing w:before="120"/>
-      </w:pPr>
-      <w:r>
-        <w:rPr>
-          <w:rFonts w:ascii="Arial" w:hAnsi="Arial" w:cs="Arial"/>
-          <w:sz w:val="24"/>
-          <w:sz-cs w:val="24"/>
-        </w:rPr>
-        <w:t xml:space="preserve">Loại giấy tờ pháp lý của cá nhân (</w:t>
-      </w:r>
-      <w:r>
-        <w:rPr>
-          <w:rFonts w:ascii="Arial" w:hAnsi="Arial" w:cs="Arial"/>
-          <w:sz w:val="24"/>
-          <w:sz-cs w:val="24"/>
-          <w:i/>
-        </w:rPr>
-        <w:t xml:space="preserve">kê khai theo giấy tờ pháp lý của cá nhân được ghi trên Giấy chứng nhận đăng ký thuế của cơ sở bảo trợ xã hội/quỹ xã hội/quỹ từ thiện</w:t>
-      </w:r>
-      <w:r>
-        <w:rPr>
-          <w:rFonts w:ascii="Arial" w:hAnsi="Arial" w:cs="Arial"/>
-          <w:sz w:val="24"/>
-          <w:sz-cs w:val="24"/>
-        </w:rPr>
-        <w:t xml:space="preserve">):</w:t>
-      </w:r>
-    </w:p>
-    <w:p>
-      <w:pPr>
-        <w:spacing w:before="120"/>
-      </w:pPr>
-      <w:r>
-        <w:rPr>
-          <w:rFonts w:ascii="Arial" w:hAnsi="Arial" w:cs="Arial"/>
-          <w:sz w:val="24"/>
-          <w:sz-cs w:val="24"/>
-        </w:rPr>
-        <w:t xml:space="preserve">□ Chứng minh nhân dân</w:t>
-      </w:r>
-    </w:p>
-    <w:p>
-      <w:pPr>
-        <w:spacing w:before="120"/>
-      </w:pPr>
-      <w:r>
-        <w:rPr>
-          <w:rFonts w:ascii="Arial" w:hAnsi="Arial" w:cs="Arial"/>
-          <w:sz w:val="24"/>
-          <w:sz-cs w:val="24"/>
-        </w:rPr>
-        <w:t xml:space="preserve">□ Căn cước công dân</w:t>
-      </w:r>
-    </w:p>
-    <w:p>
-      <w:pPr>
-        <w:spacing w:before="120"/>
-      </w:pPr>
-      <w:r>
-        <w:rPr>
-          <w:rFonts w:ascii="Arial" w:hAnsi="Arial" w:cs="Arial"/>
-          <w:sz w:val="24"/>
-          <w:sz-cs w:val="24"/>
-        </w:rPr>
-        <w:t xml:space="preserve">□ Hộ chiếu</w:t>
-      </w:r>
-    </w:p>
-    <w:p>
-      <w:pPr>
-        <w:spacing w:before="120"/>
-      </w:pPr>
-      <w:r>
-        <w:rPr>
-          <w:rFonts w:ascii="Arial" w:hAnsi="Arial" w:cs="Arial"/>
-          <w:sz w:val="24"/>
-          <w:sz-cs w:val="24"/>
-        </w:rPr>
-        <w:t xml:space="preserve">□ Loại khác (</w:t>
-      </w:r>
-      <w:r>
-        <w:rPr>
-          <w:rFonts w:ascii="Arial" w:hAnsi="Arial" w:cs="Arial"/>
-          <w:sz w:val="24"/>
-          <w:sz-cs w:val="24"/>
-          <w:i/>
-        </w:rPr>
-        <w:t xml:space="preserve">ghi rõ</w:t>
-      </w:r>
-      <w:r>
-        <w:rPr>
-          <w:rFonts w:ascii="Arial" w:hAnsi="Arial" w:cs="Arial"/>
-          <w:sz w:val="24"/>
-          <w:sz-cs w:val="24"/>
-        </w:rPr>
-        <w:t xml:space="preserve">):…………</w:t>
-      </w:r>
-    </w:p>
-    <w:p>
-      <w:pPr>
-        <w:spacing w:before="120"/>
-      </w:pPr>
-      <w:r>
-        <w:rPr>
-          <w:rFonts w:ascii="Arial" w:hAnsi="Arial" w:cs="Arial"/>
-          <w:sz w:val="24"/>
-          <w:sz-cs w:val="24"/>
-        </w:rPr>
-        <w:t xml:space="preserve">Số giấy tờ pháp lý của cá nhân (</w:t>
-      </w:r>
-      <w:r>
-        <w:rPr>
-          <w:rFonts w:ascii="Arial" w:hAnsi="Arial" w:cs="Arial"/>
-          <w:sz w:val="24"/>
-          <w:sz-cs w:val="24"/>
-          <w:i/>
-        </w:rPr>
-        <w:t xml:space="preserve">kê khai theo giấy tờ pháp lý của cá nhân được ghi trên Giấy chứng nhận đăng ký thuế của cơ sở bảo trợ xã hội/quỹ xã hội/quỹ từ thiện</w:t>
-      </w:r>
-      <w:r>
-        <w:rPr>
-          <w:rFonts w:ascii="Arial" w:hAnsi="Arial" w:cs="Arial"/>
-          <w:sz w:val="24"/>
-          <w:sz-cs w:val="24"/>
-        </w:rPr>
-        <w:t xml:space="preserve">): ……………….</w:t>
-      </w:r>
-    </w:p>
-    <w:p>
-      <w:pPr>
-        <w:spacing w:before="120"/>
-      </w:pPr>
-      <w:r>
-        <w:rPr>
-          <w:rFonts w:ascii="Arial" w:hAnsi="Arial" w:cs="Arial"/>
-          <w:sz w:val="24"/>
-          <w:sz-cs w:val="24"/>
-        </w:rPr>
-        <w:t xml:space="preserve">Ngày cấp: …./…./….Nơi cấp: ………..Ngày hết hạn (</w:t>
-      </w:r>
-      <w:r>
-        <w:rPr>
-          <w:rFonts w:ascii="Arial" w:hAnsi="Arial" w:cs="Arial"/>
-          <w:sz w:val="24"/>
-          <w:sz-cs w:val="24"/>
-          <w:i/>
-        </w:rPr>
-        <w:t xml:space="preserve">nếu có</w:t>
-      </w:r>
-      <w:r>
-        <w:rPr>
-          <w:rFonts w:ascii="Arial" w:hAnsi="Arial" w:cs="Arial"/>
-          <w:sz w:val="24"/>
-          <w:sz-cs w:val="24"/>
-        </w:rPr>
-        <w:t xml:space="preserve">): …/…/…</w:t>
-      </w:r>
-    </w:p>
-    <w:p>
-      <w:pPr>
-        <w:spacing w:before="120"/>
-      </w:pPr>
-      <w:r>
-        <w:rPr>
-          <w:rFonts w:ascii="Arial" w:hAnsi="Arial" w:cs="Arial"/>
-          <w:sz w:val="24"/>
-          <w:sz-cs w:val="24"/>
-        </w:rPr>
-        <w:t xml:space="preserve">- </w:t>
-      </w:r>
+        <w:t xml:space="preserve">Doanh nghiệp thực hiện dự án đầu tư được đăng ký đầu tư theo thủ tục đầu tư đặc biệt □</w:t>
+      </w:r>
+    </w:p>
+    <w:p>
+      <w:pPr>
+        <w:spacing w:before="120"/>
+      </w:pPr>
       <w:r>
         <w:rPr>
           <w:rFonts w:ascii="Arial" w:hAnsi="Arial" w:cs="Arial"/>
@@ -1494,7 +1491,16 @@
           <w:sz-cs w:val="24"/>
           <w:b/>
         </w:rPr>
-        <w:t xml:space="preserve">Doanh nghiệp thực hiện dự án đầu tư được đăng ký đầu tư theo thủ tục đầu tư đặc biệt □</w:t>
+        <w:t xml:space="preserve">□ Doanh nghiệp xã hội </w:t>
+      </w:r>
+      <w:r>
+        <w:rPr>
+          <w:rFonts w:ascii="Arial" w:hAnsi="Arial" w:cs="Arial"/>
+          <w:sz w:val="24"/>
+          <w:sz-cs w:val="24"/>
+          <w:i/>
+        </w:rPr>
+        <w:t xml:space="preserve">(Đánh dấu X vào ô vuông nếu là doanh nghiệp xã hội và kèm theo hồ sơ phải có Cam kết thực hiện mục tiêu xã hội, môi trường)</w:t>
       </w:r>
     </w:p>
     <w:p>
@@ -1508,29 +1514,6 @@
           <w:sz-cs w:val="24"/>
           <w:b/>
         </w:rPr>
-        <w:t xml:space="preserve">□ Doanh nghiệp xã hội </w:t>
-      </w:r>
-      <w:r>
-        <w:rPr>
-          <w:rFonts w:ascii="Arial" w:hAnsi="Arial" w:cs="Arial"/>
-          <w:sz w:val="24"/>
-          <w:sz-cs w:val="24"/>
-          <w:i/>
-        </w:rPr>
-        <w:t xml:space="preserve">(Đánh dấu X vào ô vuông nếu là doanh nghiệp xã hội và kèm theo hồ sơ phải có Cam kết thực hiện mục tiêu xã hội, môi trường)</w:t>
-      </w:r>
-    </w:p>
-    <w:p>
-      <w:pPr>
-        <w:spacing w:before="120"/>
-      </w:pPr>
-      <w:r>
-        <w:rPr>
-          <w:rFonts w:ascii="Arial" w:hAnsi="Arial" w:cs="Arial"/>
-          <w:sz w:val="24"/>
-          <w:sz-cs w:val="24"/>
-          <w:b/>
-        </w:rPr>
         <w:t xml:space="preserve">□ Công ty chứng khoán/Công ty quản lý quỹ đầu tư chứng khoán/Công ty đầu tư chứng khoán</w:t>
       </w:r>
       <w:r>
@@ -1561,24 +1544,22 @@
           <w:sz w:val="24"/>
           <w:sz-cs w:val="24"/>
         </w:rPr>
-        <w:t xml:space="preserve">Giấy phép thành lập và hoạt động số: …… do Ủy ban Chứng khoán Nhà nước cấp ngày: …./…./….. (</w:t>
-      </w:r>
-      <w:r>
-        <w:rPr>
-          <w:rFonts w:ascii="Arial" w:hAnsi="Arial" w:cs="Arial"/>
-          <w:sz w:val="24"/>
-          <w:sz-cs w:val="24"/>
-          <w:i/>
-        </w:rPr>
-        <w:t xml:space="preserve">nếu có</w:t>
-      </w:r>
-      <w:r>
-        <w:rPr>
-          <w:rFonts w:ascii="Arial" w:hAnsi="Arial" w:cs="Arial"/>
-          <w:sz w:val="24"/>
-          <w:sz-cs w:val="24"/>
-        </w:rPr>
-        <w:t xml:space="preserve">)</w:t>
+        <w:t>Giấy phép thành lập và hoạt động số: …… do Uỷ ban Chứng khoán Nhà nước cấp ngày: …./…./….. (nếu có)</w:t>
+      </w:r>
+      <w:r>
+        <w:rPr>
+          <w:rFonts w:ascii="Arial" w:hAnsi="Arial" w:cs="Arial"/>
+          <w:sz w:val="24"/>
+          <w:sz-cs w:val="24"/>
+          <w:i/>
+        </w:rPr>
+      </w:r>
+      <w:r>
+        <w:rPr>
+          <w:rFonts w:ascii="Arial" w:hAnsi="Arial" w:cs="Arial"/>
+          <w:sz w:val="24"/>
+          <w:sz-cs w:val="24"/>
+        </w:rPr>
       </w:r>
     </w:p>
     <w:p>
@@ -2584,24 +2565,22 @@
           <w:sz w:val="24"/>
           <w:sz-cs w:val="24"/>
         </w:rPr>
-        <w:t xml:space="preserve">- Thông tin về Giấy chứng nhận đăng ký đầu tư (</w:t>
-      </w:r>
-      <w:r>
-        <w:rPr>
-          <w:rFonts w:ascii="Arial" w:hAnsi="Arial" w:cs="Arial"/>
-          <w:sz w:val="24"/>
-          <w:sz-cs w:val="24"/>
-          <w:i/>
-        </w:rPr>
-        <w:t xml:space="preserve">chỉ kê khai nếu chủ sở hữu là nhà đầu tư nước ngoài</w:t>
-      </w:r>
-      <w:r>
-        <w:rPr>
-          <w:rFonts w:ascii="Arial" w:hAnsi="Arial" w:cs="Arial"/>
-          <w:sz w:val="24"/>
-          <w:sz-cs w:val="24"/>
-        </w:rPr>
-        <w:t xml:space="preserve">):</w:t>
+        <w:t>- Thông tin về Giấy chứng nhận đăng ký đầu tư (chỉ kê khai nếu chủ sở hữu là nhà đầu tư nước ngoài được cấp Giấy chứng nhận đăng ký đầu tư theo quy định của pháp luật – nếu có):</w:t>
+      </w:r>
+      <w:r>
+        <w:rPr>
+          <w:rFonts w:ascii="Arial" w:hAnsi="Arial" w:cs="Arial"/>
+          <w:sz w:val="24"/>
+          <w:sz-cs w:val="24"/>
+          <w:i/>
+        </w:rPr>
+      </w:r>
+      <w:r>
+        <w:rPr>
+          <w:rFonts w:ascii="Arial" w:hAnsi="Arial" w:cs="Arial"/>
+          <w:sz w:val="24"/>
+          <w:sz-cs w:val="24"/>
+        </w:rPr>
       </w:r>
     </w:p>
     <w:p>
@@ -2905,7 +2884,7 @@
           <w:sz w:val="24"/>
           <w:sz-cs w:val="24"/>
         </w:rPr>
-        <w:t xml:space="preserve">STTTên người đại diện theo pháp luật/người đại diện theo ủy quyềnNgày, tháng, năm sinhGiới tínhSố, ngày cấp, cơ quan cấp Giấy tờ pháp lý của cá nhân</w:t>
+        <w:t>STTTên người đại diện theo pháp luật/người đại diện theo ủy quyềnNgày, tháng, năm sinhGiới tínhSố, ngày cấp, cơ quan cấp Giấy tờ pháp lý của cá nhân5Quốc tịchDân tộcĐịa chỉ liên lạcVốn được ủy quyền6Chữ ký của người đại diện theo pháp luật/người đại diện theo ủy quyền8Ghi chú (nếu có)Tổng giá trị vốn được đại diện (bằng số; VNĐ và giá trị tương đương theo đơn vị tiền nước ngoài, nếu có)Tỷ lệ7 (%)Thời điểm đại diện phần vốn12345678910111213- Thông tin về Giấy chứng nhận đăng ký đầu tư (chỉ kê khai nếu chủ sở hữu là nhà đầu tư nước ngoài được cấp Giấy chứng nhận đăng ký đầu tư theo quy định của pháp luật – nếu có):</w:t>
       </w:r>
       <w:r>
         <w:rPr>
@@ -2914,15 +2893,13 @@
           <w:sz-cs w:val="24"/>
           <w:vertAlign w:val="superscript"/>
         </w:rPr>
-        <w:t xml:space="preserve">5</w:t>
-      </w:r>
-      <w:r>
-        <w:rPr>
-          <w:rFonts w:ascii="Arial" w:hAnsi="Arial" w:cs="Arial"/>
-          <w:sz w:val="24"/>
-          <w:sz-cs w:val="24"/>
-        </w:rPr>
-        <w:t xml:space="preserve">Quốc tịchDân tộcĐịa chỉ liên lạcVốn được ủy quyền</w:t>
+      </w:r>
+      <w:r>
+        <w:rPr>
+          <w:rFonts w:ascii="Arial" w:hAnsi="Arial" w:cs="Arial"/>
+          <w:sz w:val="24"/>
+          <w:sz-cs w:val="24"/>
+        </w:rPr>
       </w:r>
       <w:r>
         <w:rPr>
@@ -2931,15 +2908,13 @@
           <w:sz-cs w:val="24"/>
           <w:vertAlign w:val="superscript"/>
         </w:rPr>
-        <w:t xml:space="preserve">6</w:t>
-      </w:r>
-      <w:r>
-        <w:rPr>
-          <w:rFonts w:ascii="Arial" w:hAnsi="Arial" w:cs="Arial"/>
-          <w:sz w:val="24"/>
-          <w:sz-cs w:val="24"/>
-        </w:rPr>
-        <w:t xml:space="preserve">Chữ ký của người đại diện theo pháp luật/người đại diện theo ủy quyền</w:t>
+      </w:r>
+      <w:r>
+        <w:rPr>
+          <w:rFonts w:ascii="Arial" w:hAnsi="Arial" w:cs="Arial"/>
+          <w:sz w:val="24"/>
+          <w:sz-cs w:val="24"/>
+        </w:rPr>
       </w:r>
       <w:r>
         <w:rPr>
@@ -2948,48 +2923,42 @@
           <w:sz-cs w:val="24"/>
           <w:vertAlign w:val="superscript"/>
         </w:rPr>
-        <w:t xml:space="preserve">8</w:t>
-      </w:r>
-      <w:r>
-        <w:rPr>
-          <w:rFonts w:ascii="Arial" w:hAnsi="Arial" w:cs="Arial"/>
-          <w:sz w:val="24"/>
-          <w:sz-cs w:val="24"/>
-        </w:rPr>
-        <w:t xml:space="preserve">Ghi chú (nếu có)</w:t>
-      </w:r>
-      <w:r>
-        <w:rPr>
-          <w:rFonts w:ascii="Arial" w:hAnsi="Arial" w:cs="Arial"/>
-          <w:sz w:val="24"/>
-          <w:sz-cs w:val="24"/>
-        </w:rPr>
-        <w:t xml:space="preserve"/>
-      </w:r>
-      <w:r>
-        <w:rPr>
-          <w:rFonts w:ascii="Arial" w:hAnsi="Arial" w:cs="Arial"/>
-          <w:sz w:val="24"/>
-          <w:sz-cs w:val="24"/>
-        </w:rPr>
-        <w:t xml:space="preserve">Tổng giá trị vốn được đại diện (</w:t>
-      </w:r>
-      <w:r>
-        <w:rPr>
-          <w:rFonts w:ascii="Arial" w:hAnsi="Arial" w:cs="Arial"/>
-          <w:sz w:val="24"/>
-          <w:sz-cs w:val="24"/>
-          <w:i/>
-        </w:rPr>
-        <w:t xml:space="preserve">bằng số; VNĐ và giá trị tương đương theo đơn vị tiền nước ngoài, nếu có)</w:t>
-      </w:r>
-      <w:r>
-        <w:rPr>
-          <w:rFonts w:ascii="Arial" w:hAnsi="Arial" w:cs="Arial"/>
-          <w:sz w:val="24"/>
-          <w:sz-cs w:val="24"/>
-        </w:rPr>
-        <w:t xml:space="preserve">Tỷ lệ</w:t>
+      </w:r>
+      <w:r>
+        <w:rPr>
+          <w:rFonts w:ascii="Arial" w:hAnsi="Arial" w:cs="Arial"/>
+          <w:sz w:val="24"/>
+          <w:sz-cs w:val="24"/>
+        </w:rPr>
+      </w:r>
+      <w:r>
+        <w:rPr>
+          <w:rFonts w:ascii="Arial" w:hAnsi="Arial" w:cs="Arial"/>
+          <w:sz w:val="24"/>
+          <w:sz-cs w:val="24"/>
+        </w:rPr>
+      </w:r>
+      <w:r>
+        <w:rPr>
+          <w:rFonts w:ascii="Arial" w:hAnsi="Arial" w:cs="Arial"/>
+          <w:sz w:val="24"/>
+          <w:sz-cs w:val="24"/>
+        </w:rPr>
+      </w:r>
+      <w:r>
+        <w:rPr>
+          <w:rFonts w:ascii="Arial" w:hAnsi="Arial" w:cs="Arial"/>
+          <w:sz w:val="24"/>
+          <w:sz-cs w:val="24"/>
+          <w:i/>
+        </w:rPr>
+      </w:r>
+      <w:r>
+        <w:rPr>
+          <w:rFonts w:ascii="Arial" w:hAnsi="Arial" w:cs="Arial"/>
+          <w:sz w:val="24"/>
+          <w:sz-cs w:val="24"/>
+        </w:rPr>
       </w:r>
       <w:r>
         <w:rPr>
@@ -2998,23 +2967,20 @@
           <w:sz-cs w:val="24"/>
           <w:vertAlign w:val="superscript"/>
         </w:rPr>
-        <w:t xml:space="preserve">7</w:t>
-      </w:r>
-      <w:r>
-        <w:rPr>
-          <w:rFonts w:ascii="Arial" w:hAnsi="Arial" w:cs="Arial"/>
-          <w:sz w:val="24"/>
-          <w:sz-cs w:val="24"/>
-        </w:rPr>
-        <w:t xml:space="preserve"> (%)Thời điểm đại diện phần vốn</w:t>
-      </w:r>
-      <w:r>
-        <w:rPr>
-          <w:rFonts w:ascii="Arial" w:hAnsi="Arial" w:cs="Arial"/>
-          <w:sz w:val="24"/>
-          <w:sz-cs w:val="24"/>
-        </w:rPr>
-        <w:t xml:space="preserve"/>
+      </w:r>
+      <w:r>
+        <w:rPr>
+          <w:rFonts w:ascii="Arial" w:hAnsi="Arial" w:cs="Arial"/>
+          <w:sz w:val="24"/>
+          <w:sz-cs w:val="24"/>
+        </w:rPr>
+      </w:r>
+      <w:r>
+        <w:rPr>
+          <w:rFonts w:ascii="Arial" w:hAnsi="Arial" w:cs="Arial"/>
+          <w:sz w:val="24"/>
+          <w:sz-cs w:val="24"/>
+        </w:rPr>
       </w:r>
       <w:r>
         <w:rPr>
@@ -3023,56 +2989,49 @@
           <w:sz-cs w:val="24"/>
           <w:b/>
         </w:rPr>
-        <w:t xml:space="preserve">12345678910111213</w:t>
-      </w:r>
-      <w:r>
-        <w:rPr>
-          <w:rFonts w:ascii="Arial" w:hAnsi="Arial" w:cs="Arial"/>
-          <w:sz w:val="24"/>
-          <w:sz-cs w:val="24"/>
-        </w:rPr>
-        <w:t xml:space="preserve"/>
-      </w:r>
-      <w:r>
-        <w:rPr>
-          <w:rFonts w:ascii="Arial" w:hAnsi="Arial" w:cs="Arial"/>
-          <w:sz w:val="24"/>
-          <w:sz-cs w:val="24"/>
-        </w:rPr>
-        <w:t xml:space="preserve"/>
-      </w:r>
-      <w:r>
-        <w:rPr>
-          <w:rFonts w:ascii="Arial" w:hAnsi="Arial" w:cs="Arial"/>
-          <w:sz w:val="24"/>
-          <w:sz-cs w:val="24"/>
-        </w:rPr>
-        <w:t xml:space="preserve"/>
-      </w:r>
-      <w:r>
-        <w:rPr>
-          <w:rFonts w:ascii="Arial" w:hAnsi="Arial" w:cs="Arial"/>
-          <w:sz w:val="24"/>
-          <w:sz-cs w:val="24"/>
-        </w:rPr>
-        <w:t xml:space="preserve">- Thông tin về Giấy chứng nhận đăng ký đầu tư (</w:t>
-      </w:r>
-      <w:r>
-        <w:rPr>
-          <w:rFonts w:ascii="Arial" w:hAnsi="Arial" w:cs="Arial"/>
-          <w:sz w:val="24"/>
-          <w:sz-cs w:val="24"/>
-          <w:i/>
-        </w:rPr>
-        <w:t xml:space="preserve">chỉ kê khai nếu chủ sở hữu là nhà đầu tư nước ngoài</w:t>
-      </w:r>
-      <w:r>
-        <w:rPr>
-          <w:rFonts w:ascii="Arial" w:hAnsi="Arial" w:cs="Arial"/>
-          <w:sz w:val="24"/>
-          <w:sz-cs w:val="24"/>
-        </w:rPr>
-        <w:t xml:space="preserve">):</w:t>
+      </w:r>
+      <w:r>
+        <w:rPr>
+          <w:rFonts w:ascii="Arial" w:hAnsi="Arial" w:cs="Arial"/>
+          <w:sz w:val="24"/>
+          <w:sz-cs w:val="24"/>
+        </w:rPr>
+      </w:r>
+      <w:r>
+        <w:rPr>
+          <w:rFonts w:ascii="Arial" w:hAnsi="Arial" w:cs="Arial"/>
+          <w:sz w:val="24"/>
+          <w:sz-cs w:val="24"/>
+        </w:rPr>
+      </w:r>
+      <w:r>
+        <w:rPr>
+          <w:rFonts w:ascii="Arial" w:hAnsi="Arial" w:cs="Arial"/>
+          <w:sz w:val="24"/>
+          <w:sz-cs w:val="24"/>
+        </w:rPr>
+      </w:r>
+      <w:r>
+        <w:rPr>
+          <w:rFonts w:ascii="Arial" w:hAnsi="Arial" w:cs="Arial"/>
+          <w:sz w:val="24"/>
+          <w:sz-cs w:val="24"/>
+        </w:rPr>
+      </w:r>
+      <w:r>
+        <w:rPr>
+          <w:rFonts w:ascii="Arial" w:hAnsi="Arial" w:cs="Arial"/>
+          <w:sz w:val="24"/>
+          <w:sz-cs w:val="24"/>
+          <w:i/>
+        </w:rPr>
+      </w:r>
+      <w:r>
+        <w:rPr>
+          <w:rFonts w:ascii="Arial" w:hAnsi="Arial" w:cs="Arial"/>
+          <w:sz w:val="24"/>
+          <w:sz-cs w:val="24"/>
+        </w:rPr>
       </w:r>
     </w:p>
     <w:p>
@@ -5807,7 +5766,7 @@
           <w:sz-cs w:val="24"/>
           <w:b/>
         </w:rPr>
-        <w:t xml:space="preserve">12. Thông tin về chủ sở hữu hưởng lợi của doanh nghiệp</w:t>
+        <w:t>12. Thông tin về chủ sở hữu hưởng lợi của doanh nghiệp:</w:t>
       </w:r>
       <w:r>
         <w:rPr>
@@ -5816,7 +5775,6 @@
           <w:sz-cs w:val="24"/>
           <w:vertAlign w:val="superscript"/>
         </w:rPr>
-        <w:t xml:space="preserve">14</w:t>
       </w:r>
       <w:r>
         <w:rPr>
@@ -5825,54 +5783,26 @@
           <w:sz-cs w:val="24"/>
           <w:b/>
         </w:rPr>
-        <w:t xml:space="preserve">:</w:t>
-      </w:r>
-      <w:r>
-        <w:rPr>
-          <w:rFonts w:ascii="Arial" w:hAnsi="Arial" w:cs="Arial"/>
-          <w:sz w:val="24"/>
-          <w:sz-cs w:val="24"/>
-        </w:rPr>
-        <w:t xml:space="preserve"/>
-      </w:r>
-    </w:p>
-    <w:p>
-      <w:pPr>
-        <w:spacing w:before="120"/>
-      </w:pPr>
-      <w:r>
-        <w:rPr>
-          <w:rFonts w:ascii="Arial" w:hAnsi="Arial" w:cs="Arial"/>
-          <w:sz w:val="24"/>
-          <w:sz-cs w:val="24"/>
-        </w:rPr>
-        <w:t xml:space="preserve">Doanh nghiệp có chủ sở hữu hưởng lợi không?</w:t>
-      </w:r>
-    </w:p>
-    <w:p>
-      <w:pPr>
-        <w:spacing w:before="120"/>
-      </w:pPr>
-      <w:r>
-        <w:rPr>
-          <w:rFonts w:ascii="Arial" w:hAnsi="Arial" w:cs="Arial"/>
-          <w:sz w:val="24"/>
-          <w:sz-cs w:val="24"/>
-        </w:rPr>
-        <w:t xml:space="preserve">□ Có</w:t>
-      </w:r>
-    </w:p>
-    <w:p>
-      <w:pPr>
-        <w:spacing w:before="120"/>
-      </w:pPr>
-      <w:r>
-        <w:rPr>
-          <w:rFonts w:ascii="Arial" w:hAnsi="Arial" w:cs="Arial"/>
-          <w:sz w:val="24"/>
-          <w:sz-cs w:val="24"/>
-        </w:rPr>
-        <w:t xml:space="preserve"> □ Không</w:t>
+      </w:r>
+      <w:r>
+        <w:rPr>
+          <w:rFonts w:ascii="Arial" w:hAnsi="Arial" w:cs="Arial"/>
+          <w:sz w:val="24"/>
+          <w:sz-cs w:val="24"/>
+        </w:rPr>
+      </w:r>
+    </w:p>
+    <w:p>
+      <w:pPr>
+        <w:spacing w:before="120"/>
+      </w:pPr>
+      <w:r>
+        <w:rPr>
+          <w:rFonts w:ascii="Arial" w:hAnsi="Arial" w:cs="Arial"/>
+          <w:sz w:val="24"/>
+          <w:sz-cs w:val="24"/>
+        </w:rPr>
+        <w:t>Doanh nghiệp kê khai thông tin về chủ sở hữu hưởng lợi của doanh nghiệp theo Mẫu số 10 ban hành kèm theo Thông tư này.</w:t>
       </w:r>
     </w:p>
     <w:p>
@@ -5886,6 +5816,14 @@
           <w:sz-cs w:val="24"/>
         </w:rPr>
         <w:t xml:space="preserve">Trường hợp hồ sơ đăng ký doanh nghiệp hợp lệ, đề nghị Quý Cơ quan đăng công bố nội dung đăng ký doanh nghiệp trên Cổng thông tin quốc gia về đăng ký doanh nghiệp.</w:t>
+      </w:r>
+    </w:p>
+    <w:p>
+      <w:pPr>
+        <w:spacing w:before="120"/>
+      </w:pPr>
+      <w:r>
+        <w:t>Xin gửi kèm cam kết của nhà đầu tư nước ngoài theo quy định tại Điều 7 Nghị định số 296/2026/NĐ-CP ngày 23/7/2026 của Chính phủ sửa đổi, bổ sung một số điều của Nghị định số 168/2025/NĐ-CP ngày 30/6/2025 của Chính phủ về đăng ký doanh nghiệp tại Phụ lục kèm theo Giấy đề nghị này14.</w:t>
       </w:r>
     </w:p>
     <w:p>
@@ -6370,6 +6308,229 @@
           <w:sz-cs w:val="24"/>
         </w:rPr>
         <w:t xml:space="preserve"> Không kê khai trong trường hợp thành lập doanh nghiệp trên cơ sở chuyển đổi loại hình doanh nghiệp.</w:t>
+      </w:r>
+    </w:p>
+    <w:p>
+      <w:pPr>
+        <w:spacing w:before="120"/>
+      </w:pPr>
+      <w:r>
+        <w:t>14 Doanh nghiệp chỉ ghi nội dung này và gửi phụ lục kèm theo trong trường hợp doanh nghiệp là tổ chức kinh tế thực hiện dự án do nhà đầu tư nước ngoài thành lập trước khi thực hiện thủ tục cấp, điều chỉnh Giấy chứng nhận đăng ký đầu tư theo quy định của pháp luật về đầu tư.</w:t>
+      </w:r>
+    </w:p>
+    <w:p>
+      <w:pPr>
+        <w:spacing w:before="120"/>
+      </w:pPr>
+      <w:r>
+        <w:t>15 - Người đại diện theo pháp luật của doanh nghiệp ký trực tiếp vào phần này.</w:t>
+      </w:r>
+    </w:p>
+    <w:p>
+      <w:pPr>
+        <w:spacing w:before="120"/>
+      </w:pPr>
+      <w:r>
+        <w:t>- Trường hợp đăng ký chuyển đổi loại hình doanh nghiệp đồng thời đăng ký thay đổi người đại diện theo pháp luật thì Chủ tịch công ty/Chủ tịch Hội đồng thành viên của công ty sau chuyển đổi ký trực tiếp vào phần này.</w:t>
+      </w:r>
+    </w:p>
+    <w:p>
+      <w:pPr>
+        <w:spacing w:before="120"/>
+      </w:pPr>
+      <w:r>
+        <w:t>Phụ lục</w:t>
+      </w:r>
+    </w:p>
+    <w:p>
+      <w:pPr>
+        <w:spacing w:before="120"/>
+      </w:pPr>
+      <w:r>
+        <w:rPr>
+          <w:i/>
+        </w:rPr>
+        <w:t>(Kèm theo Giấy đề nghị đăng ký doanh nghiệp …1)</w:t>
+      </w:r>
+    </w:p>
+    <w:p>
+      <w:pPr>
+        <w:spacing w:before="120"/>
+      </w:pPr>
+      <w:r>
+        <w:t>CỘNG HÒA XÃ HỘI CHỦ NGHĨA VIỆT NAM</w:t>
+      </w:r>
+    </w:p>
+    <w:p>
+      <w:pPr>
+        <w:spacing w:before="120"/>
+      </w:pPr>
+      <w:r>
+        <w:t>Độc lập - Tự do - Hạnh phúc</w:t>
+      </w:r>
+    </w:p>
+    <w:p>
+      <w:pPr>
+        <w:spacing w:before="120"/>
+      </w:pPr>
+      <w:r>
+        <w:rPr>
+          <w:i/>
+        </w:rPr>
+        <w:t>……, ngày …… tháng …… năm ……</w:t>
+      </w:r>
+    </w:p>
+    <w:p>
+      <w:pPr>
+        <w:spacing w:before="120"/>
+      </w:pPr>
+      <w:r>
+        <w:t>CAM KẾT</w:t>
+      </w:r>
+    </w:p>
+    <w:p>
+      <w:pPr>
+        <w:spacing w:before="120"/>
+      </w:pPr>
+      <w:r>
+        <w:t>Về việc đáp ứng điều kiện tiếp cận thị trường đối với nhà đầu tư nước ngoài</w:t>
+      </w:r>
+    </w:p>
+    <w:p>
+      <w:pPr>
+        <w:spacing w:before="120"/>
+      </w:pPr>
+      <w:r>
+        <w:t>theo quy định của pháp luật</w:t>
+      </w:r>
+    </w:p>
+    <w:p>
+      <w:pPr>
+        <w:spacing w:before="120"/>
+      </w:pPr>
+      <w:r>
+        <w:t>Kính gửi: (Cơ quan đăng ký kinh doanh cấp tỉnh) ………………….</w:t>
+      </w:r>
+    </w:p>
+    <w:p>
+      <w:pPr>
+        <w:spacing w:before="120"/>
+      </w:pPr>
+      <w:r>
+        <w:t>Nhà đầu tư nước ngoài có thông tin dưới đây:</w:t>
+      </w:r>
+    </w:p>
+    <w:p>
+      <w:pPr>
+        <w:spacing w:before="120"/>
+      </w:pPr>
+      <w:r>
+        <w:rPr>
+          <w:i/>
+        </w:rPr>
+        <w:t>(Trường hợp chủ sở hữu là cá nhân thì kê khai:)</w:t>
+      </w:r>
+    </w:p>
+    <w:p>
+      <w:pPr>
+        <w:spacing w:before="120"/>
+      </w:pPr>
+      <w:r>
+        <w:t>Họ, chữ đệm và tên (ghi bằng chữ in hoa): …………………………………….</w:t>
+      </w:r>
+    </w:p>
+    <w:p>
+      <w:pPr>
+        <w:spacing w:before="120"/>
+      </w:pPr>
+      <w:r>
+        <w:t>Số định danh cá nhân: … / Số Hộ chiếu nước ngoài hoặc giấy tờ có giá trị thay thế Hộ chiếu nước ngoài: … Ngày cấp: … Nơi cấp: …</w:t>
+      </w:r>
+    </w:p>
+    <w:p>
+      <w:pPr>
+        <w:spacing w:before="120"/>
+      </w:pPr>
+      <w:r>
+        <w:rPr>
+          <w:i/>
+        </w:rPr>
+        <w:t>(Trường hợp chủ sở hữu là tổ chức thì kê khai:)</w:t>
+      </w:r>
+    </w:p>
+    <w:p>
+      <w:pPr>
+        <w:spacing w:before="120"/>
+      </w:pPr>
+      <w:r>
+        <w:t>Tên tổ chức (ghi bằng chữ in hoa): ……………………………………………….</w:t>
+      </w:r>
+    </w:p>
+    <w:p>
+      <w:pPr>
+        <w:spacing w:before="120"/>
+      </w:pPr>
+      <w:r>
+        <w:t>Mã số doanh nghiệp/Số Quyết định thành lập: ………………………………….</w:t>
+      </w:r>
+    </w:p>
+    <w:p>
+      <w:pPr>
+        <w:spacing w:before="120"/>
+      </w:pPr>
+      <w:r>
+        <w:t>Người đại diện theo pháp luật (ghi bằng chữ in hoa): ……………………….</w:t>
+      </w:r>
+    </w:p>
+    <w:p>
+      <w:pPr>
+        <w:spacing w:before="120"/>
+      </w:pPr>
+      <w:r>
+        <w:t>Số định danh cá nhân: … / Số Hộ chiếu nước ngoài hoặc giấy tờ có giá trị thay thế Hộ chiếu nước ngoài: … Ngày cấp: … Nơi cấp: …</w:t>
+      </w:r>
+    </w:p>
+    <w:p>
+      <w:pPr>
+        <w:spacing w:before="120"/>
+      </w:pPr>
+      <w:r>
+        <w:t>Cam kết đáp ứng điều kiện tiếp cận thị trường đối với nhà đầu tư nước ngoài theo quy định của pháp luật khi thực hiện thủ tục thành lập ..2 và hoàn toàn chịu trách nhiệm trước pháp luật về tính hợp pháp, chính xác và trung thực của nội dung Cam kết này.</w:t>
+      </w:r>
+    </w:p>
+    <w:p>
+      <w:pPr>
+        <w:spacing w:before="120"/>
+      </w:pPr>
+      <w:r>
+        <w:t>NHÀ ĐẦU TƯ NƯỚC NGOÀI</w:t>
+      </w:r>
+    </w:p>
+    <w:p>
+      <w:pPr>
+        <w:spacing w:before="120"/>
+      </w:pPr>
+      <w:r>
+        <w:rPr>
+          <w:i/>
+        </w:rPr>
+        <w:t>(Ký và ghi họ tên)3</w:t>
+      </w:r>
+    </w:p>
+    <w:p>
+      <w:pPr>
+        <w:spacing w:before="120"/>
+      </w:pPr>
+      <w:r>
+        <w:t>1,2 Ghi tên doanh nghiệp dự kiến thành lập.</w:t>
+      </w:r>
+    </w:p>
+    <w:p>
+      <w:pPr>
+        <w:spacing w:before="120"/>
+      </w:pPr>
+      <w:r>
+        <w:t>3 Nhà đầu tư nước ngoài là cá nhân hoặc người đại diện theo pháp luật của nhà đầu tư nước ngoài là tổ chức ký trực tiếp vào phần này.</w:t>
       </w:r>
     </w:p>
     <w:sectPr>

</xml_diff>